<commit_message>
creating complete data files 2005
</commit_message>
<xml_diff>
--- a/notebooks/2005_Birth/01_birth_records_quality_report.docx
+++ b/notebooks/2005_Birth/01_birth_records_quality_report.docx
@@ -13,12 +13,12 @@
     </w:p>
     <w:p>
       <w:r>
-        <w:t>Generated: 2026-04-24 05:55</w:t>
+        <w:t>Generated: 2026-04-30 19:03</w:t>
       </w:r>
     </w:p>
     <w:p>
       <w:r>
-        <w:t>Dataset: 370,731 birth records × 13 variables</w:t>
+        <w:t>Dataset: 370,725 birth records × 14 variables</w:t>
       </w:r>
     </w:p>
     <w:p/>
@@ -37,9 +37,9 @@
         <w:t>Key findings include:</w:t>
         <w:br/>
         <w:br/>
-        <w:t>• **Dataset Overview**: 370,731 total birth records with 13 variables</w:t>
+        <w:t>• **Dataset Overview**: 370,725 total birth records with 14 variables</w:t>
         <w:br/>
-        <w:t>• **Data Completeness**: 370,628 records (100.0%) are completely filled with no missing values</w:t>
+        <w:t>• **Data Completeness**: 370,622 records (100.0%) are completely filled with no missing values</w:t>
         <w:br/>
         <w:t>• **Records with Missing Data**: 103 records (0.0%) contain at least one missing value</w:t>
         <w:br/>
@@ -49,7 +49,7 @@
         <w:br/>
         <w:t>• **Maximum Missing**: The record with most missing data has 1 missing values</w:t>
         <w:br/>
-        <w:t>• **Variables with Missing Data**: 2 out of 13 variables have missing values</w:t>
+        <w:t>• **Variables with Missing Data**: 2 out of 14 variables have missing values</w:t>
         <w:br/>
         <w:t>• **Critical Variables**: ['Birth_Order', 'Race_of_Mother', 'Registered_District'] have the highest missing rates</w:t>
       </w:r>
@@ -127,7 +127,7 @@
               <w:jc w:val="right"/>
             </w:pPr>
             <w:r>
-              <w:t>370731.0</w:t>
+              <w:t>370725.0</w:t>
             </w:r>
           </w:p>
         </w:tc>
@@ -152,7 +152,7 @@
               <w:jc w:val="right"/>
             </w:pPr>
             <w:r>
-              <w:t>13.0</w:t>
+              <w:t>14.0</w:t>
             </w:r>
           </w:p>
         </w:tc>
@@ -252,7 +252,7 @@
               <w:jc w:val="right"/>
             </w:pPr>
             <w:r>
-              <w:t>370628.0</w:t>
+              <w:t>370622.0</w:t>
             </w:r>
           </w:p>
         </w:tc>
@@ -393,7 +393,7 @@
     </w:p>
     <w:p>
       <w:r>
-        <w:t>Found 370,628 completely filled birth records (100.0% of total). These records can be used for immediate analysis without imputation.</w:t>
+        <w:t>Found 370,622 completely filled birth records (100.0% of total). These records can be used for immediate analysis without imputation.</w:t>
       </w:r>
     </w:p>
     <w:p>
@@ -431,7 +431,7 @@
       <w:r>
         <w:drawing>
           <wp:inline xmlns:a="http://schemas.openxmlformats.org/drawingml/2006/main" xmlns:pic="http://schemas.openxmlformats.org/drawingml/2006/picture">
-            <wp:extent cx="5943600" cy="3373543"/>
+            <wp:extent cx="5943600" cy="3540478"/>
             <wp:docPr id="1" name="Picture 1"/>
             <wp:cNvGraphicFramePr>
               <a:graphicFrameLocks noChangeAspect="1"/>
@@ -452,7 +452,7 @@
                   <pic:spPr>
                     <a:xfrm>
                       <a:off x="0" y="0"/>
-                      <a:ext cx="5943600" cy="3373543"/>
+                      <a:ext cx="5943600" cy="3540478"/>
                     </a:xfrm>
                     <a:prstGeom prst="rect"/>
                   </pic:spPr>
@@ -729,7 +729,7 @@
               <w:jc w:val="right"/>
             </w:pPr>
             <w:r>
-              <w:t>370,652</w:t>
+              <w:t>370,646</w:t>
             </w:r>
           </w:p>
         </w:tc>
@@ -816,7 +816,7 @@
               <w:jc w:val="right"/>
             </w:pPr>
             <w:r>
-              <w:t>370,707</w:t>
+              <w:t>370,701</w:t>
             </w:r>
           </w:p>
         </w:tc>
@@ -903,7 +903,181 @@
               <w:jc w:val="right"/>
             </w:pPr>
             <w:r>
-              <w:t>370,731</w:t>
+              <w:t>370,725</w:t>
+            </w:r>
+          </w:p>
+        </w:tc>
+        <w:tc>
+          <w:tcPr>
+            <w:tcW w:type="dxa" w:w="1234"/>
+          </w:tcPr>
+          <w:p>
+            <w:pPr>
+              <w:jc w:val="right"/>
+            </w:pPr>
+            <w:r>
+              <w:t>100.0%</w:t>
+            </w:r>
+          </w:p>
+        </w:tc>
+      </w:tr>
+      <w:tr>
+        <w:tc>
+          <w:tcPr>
+            <w:tcW w:type="dxa" w:w="1234"/>
+          </w:tcPr>
+          <w:p>
+            <w:r>
+              <w:t>Birh_Year 2.0</w:t>
+            </w:r>
+          </w:p>
+        </w:tc>
+        <w:tc>
+          <w:tcPr>
+            <w:tcW w:type="dxa" w:w="1234"/>
+          </w:tcPr>
+          <w:p>
+            <w:pPr>
+              <w:jc w:val="right"/>
+            </w:pPr>
+            <w:r>
+              <w:t>0</w:t>
+            </w:r>
+          </w:p>
+        </w:tc>
+        <w:tc>
+          <w:tcPr>
+            <w:tcW w:type="dxa" w:w="1234"/>
+          </w:tcPr>
+          <w:p>
+            <w:pPr>
+              <w:jc w:val="right"/>
+            </w:pPr>
+            <w:r>
+              <w:t>0.0%</w:t>
+            </w:r>
+          </w:p>
+        </w:tc>
+        <w:tc>
+          <w:tcPr>
+            <w:tcW w:type="dxa" w:w="1234"/>
+          </w:tcPr>
+          <w:p>
+            <w:r>
+              <w:t>int64</w:t>
+            </w:r>
+          </w:p>
+        </w:tc>
+        <w:tc>
+          <w:tcPr>
+            <w:tcW w:type="dxa" w:w="1234"/>
+          </w:tcPr>
+          <w:p>
+            <w:pPr>
+              <w:jc w:val="right"/>
+            </w:pPr>
+            <w:r>
+              <w:t>64</w:t>
+            </w:r>
+          </w:p>
+        </w:tc>
+        <w:tc>
+          <w:tcPr>
+            <w:tcW w:type="dxa" w:w="1234"/>
+          </w:tcPr>
+          <w:p>
+            <w:pPr>
+              <w:jc w:val="right"/>
+            </w:pPr>
+            <w:r>
+              <w:t>370,725</w:t>
+            </w:r>
+          </w:p>
+        </w:tc>
+        <w:tc>
+          <w:tcPr>
+            <w:tcW w:type="dxa" w:w="1234"/>
+          </w:tcPr>
+          <w:p>
+            <w:pPr>
+              <w:jc w:val="right"/>
+            </w:pPr>
+            <w:r>
+              <w:t>100.0%</w:t>
+            </w:r>
+          </w:p>
+        </w:tc>
+      </w:tr>
+      <w:tr>
+        <w:tc>
+          <w:tcPr>
+            <w:tcW w:type="dxa" w:w="1234"/>
+          </w:tcPr>
+          <w:p>
+            <w:r>
+              <w:t>Registered_Year</w:t>
+            </w:r>
+          </w:p>
+        </w:tc>
+        <w:tc>
+          <w:tcPr>
+            <w:tcW w:type="dxa" w:w="1234"/>
+          </w:tcPr>
+          <w:p>
+            <w:pPr>
+              <w:jc w:val="right"/>
+            </w:pPr>
+            <w:r>
+              <w:t>0</w:t>
+            </w:r>
+          </w:p>
+        </w:tc>
+        <w:tc>
+          <w:tcPr>
+            <w:tcW w:type="dxa" w:w="1234"/>
+          </w:tcPr>
+          <w:p>
+            <w:pPr>
+              <w:jc w:val="right"/>
+            </w:pPr>
+            <w:r>
+              <w:t>0.0%</w:t>
+            </w:r>
+          </w:p>
+        </w:tc>
+        <w:tc>
+          <w:tcPr>
+            <w:tcW w:type="dxa" w:w="1234"/>
+          </w:tcPr>
+          <w:p>
+            <w:r>
+              <w:t>int64</w:t>
+            </w:r>
+          </w:p>
+        </w:tc>
+        <w:tc>
+          <w:tcPr>
+            <w:tcW w:type="dxa" w:w="1234"/>
+          </w:tcPr>
+          <w:p>
+            <w:pPr>
+              <w:jc w:val="right"/>
+            </w:pPr>
+            <w:r>
+              <w:t>1</w:t>
+            </w:r>
+          </w:p>
+        </w:tc>
+        <w:tc>
+          <w:tcPr>
+            <w:tcW w:type="dxa" w:w="1234"/>
+          </w:tcPr>
+          <w:p>
+            <w:pPr>
+              <w:jc w:val="right"/>
+            </w:pPr>
+            <w:r>
+              <w:t>370,725</w:t>
             </w:r>
           </w:p>
         </w:tc>
@@ -990,94 +1164,7 @@
               <w:jc w:val="right"/>
             </w:pPr>
             <w:r>
-              <w:t>370,731</w:t>
-            </w:r>
-          </w:p>
-        </w:tc>
-        <w:tc>
-          <w:tcPr>
-            <w:tcW w:type="dxa" w:w="1234"/>
-          </w:tcPr>
-          <w:p>
-            <w:pPr>
-              <w:jc w:val="right"/>
-            </w:pPr>
-            <w:r>
-              <w:t>100.0%</w:t>
-            </w:r>
-          </w:p>
-        </w:tc>
-      </w:tr>
-      <w:tr>
-        <w:tc>
-          <w:tcPr>
-            <w:tcW w:type="dxa" w:w="1234"/>
-          </w:tcPr>
-          <w:p>
-            <w:r>
-              <w:t>Registered_Year</w:t>
-            </w:r>
-          </w:p>
-        </w:tc>
-        <w:tc>
-          <w:tcPr>
-            <w:tcW w:type="dxa" w:w="1234"/>
-          </w:tcPr>
-          <w:p>
-            <w:pPr>
-              <w:jc w:val="right"/>
-            </w:pPr>
-            <w:r>
-              <w:t>0</w:t>
-            </w:r>
-          </w:p>
-        </w:tc>
-        <w:tc>
-          <w:tcPr>
-            <w:tcW w:type="dxa" w:w="1234"/>
-          </w:tcPr>
-          <w:p>
-            <w:pPr>
-              <w:jc w:val="right"/>
-            </w:pPr>
-            <w:r>
-              <w:t>0.0%</w:t>
-            </w:r>
-          </w:p>
-        </w:tc>
-        <w:tc>
-          <w:tcPr>
-            <w:tcW w:type="dxa" w:w="1234"/>
-          </w:tcPr>
-          <w:p>
-            <w:r>
-              <w:t>int64</w:t>
-            </w:r>
-          </w:p>
-        </w:tc>
-        <w:tc>
-          <w:tcPr>
-            <w:tcW w:type="dxa" w:w="1234"/>
-          </w:tcPr>
-          <w:p>
-            <w:pPr>
-              <w:jc w:val="right"/>
-            </w:pPr>
-            <w:r>
-              <w:t>1</w:t>
-            </w:r>
-          </w:p>
-        </w:tc>
-        <w:tc>
-          <w:tcPr>
-            <w:tcW w:type="dxa" w:w="1234"/>
-          </w:tcPr>
-          <w:p>
-            <w:pPr>
-              <w:jc w:val="right"/>
-            </w:pPr>
-            <w:r>
-              <w:t>370,731</w:t>
+              <w:t>370,725</w:t>
             </w:r>
           </w:p>
         </w:tc>
@@ -1164,7 +1251,7 @@
               <w:jc w:val="right"/>
             </w:pPr>
             <w:r>
-              <w:t>370,731</w:t>
+              <w:t>370,725</w:t>
             </w:r>
           </w:p>
         </w:tc>
@@ -1251,7 +1338,7 @@
               <w:jc w:val="right"/>
             </w:pPr>
             <w:r>
-              <w:t>370,731</w:t>
+              <w:t>370,725</w:t>
             </w:r>
           </w:p>
         </w:tc>
@@ -1338,7 +1425,7 @@
               <w:jc w:val="right"/>
             </w:pPr>
             <w:r>
-              <w:t>370,731</w:t>
+              <w:t>370,725</w:t>
             </w:r>
           </w:p>
         </w:tc>
@@ -1425,7 +1512,7 @@
               <w:jc w:val="right"/>
             </w:pPr>
             <w:r>
-              <w:t>370,731</w:t>
+              <w:t>370,725</w:t>
             </w:r>
           </w:p>
         </w:tc>
@@ -1512,7 +1599,7 @@
               <w:jc w:val="right"/>
             </w:pPr>
             <w:r>
-              <w:t>370,731</w:t>
+              <w:t>370,725</w:t>
             </w:r>
           </w:p>
         </w:tc>
@@ -1599,7 +1686,7 @@
               <w:jc w:val="right"/>
             </w:pPr>
             <w:r>
-              <w:t>370,731</w:t>
+              <w:t>370,725</w:t>
             </w:r>
           </w:p>
         </w:tc>
@@ -1686,7 +1773,7 @@
               <w:jc w:val="right"/>
             </w:pPr>
             <w:r>
-              <w:t>370,731</w:t>
+              <w:t>370,725</w:t>
             </w:r>
           </w:p>
         </w:tc>
@@ -1760,7 +1847,7 @@
               <w:jc w:val="right"/>
             </w:pPr>
             <w:r>
-              <w:t>26</w:t>
+              <w:t>25</w:t>
             </w:r>
           </w:p>
         </w:tc>
@@ -1773,7 +1860,7 @@
               <w:jc w:val="right"/>
             </w:pPr>
             <w:r>
-              <w:t>370,731</w:t>
+              <w:t>370,725</w:t>
             </w:r>
           </w:p>
         </w:tc>
@@ -1813,7 +1900,7 @@
         <w:pStyle w:val="ListBullet"/>
       </w:pPr>
       <w:r>
-        <w:t>Use the 370,628 complete records for immediate analysis where possible</w:t>
+        <w:t>Use the 370,622 complete records for immediate analysis where possible</w:t>
       </w:r>
     </w:p>
     <w:p>
@@ -1952,7 +2039,7 @@
       <w:jc w:val="center"/>
     </w:pPr>
     <w:r>
-      <w:t xml:space="preserve">Birth Records Data Quality Assessment | Generated: 2026-04-24 | Page </w:t>
+      <w:t xml:space="preserve">Birth Records Data Quality Assessment | Generated: 2026-04-30 | Page </w:t>
     </w:r>
     <w:r>
       <w:fldChar w:fldCharType="begin"/>

</xml_diff>